<commit_message>
barlow: renderers - ordered-list support + multi-line list items (bullets/steps no longer render as run-on paragraphs); re-render all finesst docs
</commit_message>
<xml_diff>
--- a/barlow/docs/finesst_ancillary_docs.docx
+++ b/barlow/docs/finesst_ancillary_docs.docx
@@ -829,20 +829,7 @@
           <w:b w:val="0"/>
           <w:i w:val="0"/>
         </w:rPr>
-        <w:t>Indirect costs per the solicitation's rules for FINESST [confirm current F&amp;A</w:t>
-      </w:r>
-    </w:p>
-    <w:p>
-      <w:pPr>
-        <w:spacing w:after="120"/>
-      </w:pPr>
-      <w:r>
-        <w:rPr>
-          <w:rFonts w:ascii="Calibri" w:hAnsi="Calibri"/>
-          <w:b w:val="0"/>
-          <w:i w:val="0"/>
-        </w:rPr>
-        <w:t>treatment in the F.5 text — it differs from standard research awards].</w:t>
+        <w:t>Indirect costs per the solicitation's rules for FINESST [confirm current F&amp;A treatment in the F.5 text — it differs from standard research awards].</w:t>
       </w:r>
     </w:p>
     <w:p>
@@ -856,20 +843,7 @@
           <w:b w:val="0"/>
           <w:i w:val="0"/>
         </w:rPr>
-        <w:t>Year-over-year totals should track the stipend/tuition escalation schedule;</w:t>
-      </w:r>
-    </w:p>
-    <w:p>
-      <w:pPr>
-        <w:spacing w:after="120"/>
-      </w:pPr>
-      <w:r>
-        <w:rPr>
-          <w:rFonts w:ascii="Calibri" w:hAnsi="Calibri"/>
-          <w:b w:val="0"/>
-          <w:i w:val="0"/>
-        </w:rPr>
-        <w:t>the travel/publication mix shifts from poster (Yr 1) to talks + synthesis-paper fees (Yr 3).</w:t>
+        <w:t>Year-over-year totals should track the stipend/tuition escalation schedule; the travel/publication mix shifts from poster (Yr 1) to talks + synthesis-paper fees (Yr 3).</w:t>
       </w:r>
     </w:p>
     <w:sectPr>

</xml_diff>

<commit_message>
barlow/finesst: fix DAPR + formatting compliance (v6 proposal, 1-inch margins)
Compliance pass against the corrected F.5 FINESST-25 solicitation (sec. 5):
- Proposal v6 (from v5): convert in-text author-name citations to numerical
  DAPR callouts ("Barlow (2026)" -> "prior work [1]", etc.); anonymize the
  training-tiles table row; drop the stray AI-proofreading line (AI use is
  already disclosed in the Acknowledgements). Figures + references intact.
- Build scripts (_md_to_docx.py, _md_to_pdf.py): margins 0.9/0.7 -> 1.0 in
  all sides (DAPR requires >=1"). Regenerated OSDMP, mentoring, RRS, ancillary.
- Mentoring plan: trimmed to hold 2 pages at the wider margins (both renderers).

All components now within page limits at 1" margins: S/T/M ~6pp (excl refs),
OSDMP 2pp, mentoring 2pp, RRS 1pp.

Co-Authored-By: Claude Opus 4.8 (1M context) <noreply@anthropic.com>
</commit_message>
<xml_diff>
--- a/barlow/docs/finesst_ancillary_docs.docx
+++ b/barlow/docs/finesst_ancillary_docs.docx
@@ -315,14 +315,14 @@
         <w:tblLook w:firstColumn="1" w:firstRow="1" w:lastColumn="0" w:lastRow="0" w:noHBand="0" w:noVBand="1" w:val="04A0"/>
       </w:tblPr>
       <w:tblGrid>
-        <w:gridCol w:w="3216"/>
-        <w:gridCol w:w="3216"/>
-        <w:gridCol w:w="3216"/>
+        <w:gridCol w:w="3120"/>
+        <w:gridCol w:w="3120"/>
+        <w:gridCol w:w="3120"/>
       </w:tblGrid>
       <w:tr>
         <w:tc>
           <w:tcPr>
-            <w:tcW w:type="dxa" w:w="3216"/>
+            <w:tcW w:type="dxa" w:w="3120"/>
             <w:shd w:val="clear" w:fill="E8E8E8"/>
           </w:tcPr>
           <w:p>
@@ -347,7 +347,7 @@
         </w:tc>
         <w:tc>
           <w:tcPr>
-            <w:tcW w:type="dxa" w:w="3216"/>
+            <w:tcW w:type="dxa" w:w="3120"/>
             <w:shd w:val="clear" w:fill="E8E8E8"/>
           </w:tcPr>
           <w:p>
@@ -372,7 +372,7 @@
         </w:tc>
         <w:tc>
           <w:tcPr>
-            <w:tcW w:type="dxa" w:w="3216"/>
+            <w:tcW w:type="dxa" w:w="3120"/>
             <w:shd w:val="clear" w:fill="E8E8E8"/>
           </w:tcPr>
           <w:p>
@@ -399,7 +399,7 @@
       <w:tr>
         <w:tc>
           <w:tcPr>
-            <w:tcW w:type="dxa" w:w="3216"/>
+            <w:tcW w:type="dxa" w:w="3120"/>
           </w:tcPr>
           <w:p>
             <w:pPr>
@@ -419,7 +419,7 @@
         </w:tc>
         <w:tc>
           <w:tcPr>
-            <w:tcW w:type="dxa" w:w="3216"/>
+            <w:tcW w:type="dxa" w:w="3120"/>
           </w:tcPr>
           <w:p>
             <w:pPr>
@@ -439,7 +439,7 @@
         </w:tc>
         <w:tc>
           <w:tcPr>
-            <w:tcW w:type="dxa" w:w="3216"/>
+            <w:tcW w:type="dxa" w:w="3120"/>
           </w:tcPr>
           <w:p>
             <w:pPr>
@@ -461,7 +461,7 @@
       <w:tr>
         <w:tc>
           <w:tcPr>
-            <w:tcW w:type="dxa" w:w="3216"/>
+            <w:tcW w:type="dxa" w:w="3120"/>
           </w:tcPr>
           <w:p>
             <w:pPr>
@@ -481,7 +481,7 @@
         </w:tc>
         <w:tc>
           <w:tcPr>
-            <w:tcW w:type="dxa" w:w="3216"/>
+            <w:tcW w:type="dxa" w:w="3120"/>
           </w:tcPr>
           <w:p>
             <w:pPr>
@@ -501,7 +501,7 @@
         </w:tc>
         <w:tc>
           <w:tcPr>
-            <w:tcW w:type="dxa" w:w="3216"/>
+            <w:tcW w:type="dxa" w:w="3120"/>
           </w:tcPr>
           <w:p>
             <w:pPr>
@@ -523,7 +523,7 @@
       <w:tr>
         <w:tc>
           <w:tcPr>
-            <w:tcW w:type="dxa" w:w="3216"/>
+            <w:tcW w:type="dxa" w:w="3120"/>
           </w:tcPr>
           <w:p>
             <w:pPr>
@@ -543,7 +543,7 @@
         </w:tc>
         <w:tc>
           <w:tcPr>
-            <w:tcW w:type="dxa" w:w="3216"/>
+            <w:tcW w:type="dxa" w:w="3120"/>
           </w:tcPr>
           <w:p>
             <w:pPr>
@@ -563,7 +563,7 @@
         </w:tc>
         <w:tc>
           <w:tcPr>
-            <w:tcW w:type="dxa" w:w="3216"/>
+            <w:tcW w:type="dxa" w:w="3120"/>
           </w:tcPr>
           <w:p>
             <w:pPr>
@@ -585,7 +585,7 @@
       <w:tr>
         <w:tc>
           <w:tcPr>
-            <w:tcW w:type="dxa" w:w="3216"/>
+            <w:tcW w:type="dxa" w:w="3120"/>
           </w:tcPr>
           <w:p>
             <w:pPr>
@@ -605,7 +605,7 @@
         </w:tc>
         <w:tc>
           <w:tcPr>
-            <w:tcW w:type="dxa" w:w="3216"/>
+            <w:tcW w:type="dxa" w:w="3120"/>
           </w:tcPr>
           <w:p>
             <w:pPr>
@@ -625,7 +625,7 @@
         </w:tc>
         <w:tc>
           <w:tcPr>
-            <w:tcW w:type="dxa" w:w="3216"/>
+            <w:tcW w:type="dxa" w:w="3120"/>
           </w:tcPr>
           <w:p>
             <w:pPr>
@@ -647,7 +647,7 @@
       <w:tr>
         <w:tc>
           <w:tcPr>
-            <w:tcW w:type="dxa" w:w="3216"/>
+            <w:tcW w:type="dxa" w:w="3120"/>
           </w:tcPr>
           <w:p>
             <w:pPr>
@@ -667,7 +667,7 @@
         </w:tc>
         <w:tc>
           <w:tcPr>
-            <w:tcW w:type="dxa" w:w="3216"/>
+            <w:tcW w:type="dxa" w:w="3120"/>
           </w:tcPr>
           <w:p>
             <w:pPr>
@@ -687,7 +687,7 @@
         </w:tc>
         <w:tc>
           <w:tcPr>
-            <w:tcW w:type="dxa" w:w="3216"/>
+            <w:tcW w:type="dxa" w:w="3120"/>
           </w:tcPr>
           <w:p>
             <w:pPr>
@@ -709,7 +709,7 @@
       <w:tr>
         <w:tc>
           <w:tcPr>
-            <w:tcW w:type="dxa" w:w="3216"/>
+            <w:tcW w:type="dxa" w:w="3120"/>
           </w:tcPr>
           <w:p>
             <w:pPr>
@@ -729,7 +729,7 @@
         </w:tc>
         <w:tc>
           <w:tcPr>
-            <w:tcW w:type="dxa" w:w="3216"/>
+            <w:tcW w:type="dxa" w:w="3120"/>
           </w:tcPr>
           <w:p>
             <w:pPr>
@@ -749,7 +749,7 @@
         </w:tc>
         <w:tc>
           <w:tcPr>
-            <w:tcW w:type="dxa" w:w="3216"/>
+            <w:tcW w:type="dxa" w:w="3120"/>
           </w:tcPr>
           <w:p>
             <w:pPr>
@@ -849,7 +849,7 @@
     <w:sectPr>
       <w:footerReference w:type="default" r:id="rId9"/>
       <w:pgSz w:w="12240" w:h="15840"/>
-      <w:pgMar w:top="1008" w:right="1296" w:bottom="1008" w:left="1296" w:header="720" w:footer="720" w:gutter="0"/>
+      <w:pgMar w:top="1440" w:right="1440" w:bottom="1440" w:left="1440" w:header="720" w:footer="720" w:gutter="0"/>
       <w:cols w:space="720"/>
       <w:docGrid w:linePitch="360"/>
     </w:sectPr>

</xml_diff>

<commit_message>
barlow/finesst: tighten F&E statement to strict 5.1.2.4 scope
Drop the Data paragraph (data availability belongs to the proposal S4 table +
OSDMP, not the facilities/equipment/other-resources narrative) and the draft
scaffolding note. Add explicit regular-access statement (no resource-support
letter needed). Keeps Computing / Workspace / Software / no-field-work.
(Package copy sync pending — file open in Word.)

Co-Authored-By: Claude Opus 4.8 (1M context) <noreply@anthropic.com>
</commit_message>
<xml_diff>
--- a/barlow/docs/finesst_ancillary_docs.docx
+++ b/barlow/docs/finesst_ancillary_docs.docx
@@ -55,22 +55,9 @@
         <w:rPr>
           <w:rFonts w:ascii="Calibri" w:hAnsi="Calibri"/>
           <w:b w:val="0"/>
-          <w:i/>
-        </w:rPr>
-        <w:t>(No page limit; half a page is typical. Non-anonymized is acceptable here — confirm against the final F.5 text.)</w:t>
-      </w:r>
-    </w:p>
-    <w:p>
-      <w:pPr>
-        <w:spacing w:after="120"/>
-      </w:pPr>
-      <w:r>
-        <w:rPr>
-          <w:rFonts w:ascii="Calibri" w:hAnsi="Calibri"/>
-          <w:b w:val="0"/>
           <w:i w:val="0"/>
         </w:rPr>
-        <w:t>The proposed work requires modest, already-available resources; no facility development or shared-instrument time is needed.</w:t>
+        <w:t>The proposed work requires modest, already-available resources; no facility development or shared-instrument time is needed. The proposing team has regular access to all resources below, so no resource-support letter is required.</w:t>
       </w:r>
     </w:p>
     <w:p>
@@ -104,7 +91,7 @@
           <w:b w:val="0"/>
           <w:i w:val="0"/>
         </w:rPr>
-        <w:t>Software.</w:t>
+        <w:t>Workspace.</w:t>
       </w:r>
       <w:r>
         <w:rPr>
@@ -112,7 +99,7 @@
           <w:b w:val="0"/>
           <w:i w:val="0"/>
         </w:rPr>
-        <w:t xml:space="preserve"> The full processing stack is open source (Python scientific stack, PDAL, GDAL/OGR, WhiteboxTools, PyTorch, QGIS). No commercial licenses are required.</w:t>
+        <w:t xml:space="preserve"> The FI has [office/lab space] in [department], with institutional backup storage for working data.</w:t>
       </w:r>
     </w:p>
     <w:p>
@@ -125,7 +112,7 @@
           <w:b w:val="0"/>
           <w:i w:val="0"/>
         </w:rPr>
-        <w:t>Data.</w:t>
+        <w:t>Software.</w:t>
       </w:r>
       <w:r>
         <w:rPr>
@@ -133,28 +120,7 @@
           <w:b w:val="0"/>
           <w:i w:val="0"/>
         </w:rPr>
-        <w:t xml:space="preserve"> All required datasets are free and public (proposal §4 table); the single author-gated item (training labels) has a budgeted fallback. No data purchases.</w:t>
-      </w:r>
-    </w:p>
-    <w:p>
-      <w:pPr>
-        <w:spacing w:after="120"/>
-      </w:pPr>
-      <w:r>
-        <w:rPr>
-          <w:rFonts w:ascii="Calibri" w:hAnsi="Calibri"/>
-          <w:b w:val="0"/>
-          <w:i w:val="0"/>
-        </w:rPr>
-        <w:t>Workspace.</w:t>
-      </w:r>
-      <w:r>
-        <w:rPr>
-          <w:rFonts w:ascii="Calibri" w:hAnsi="Calibri"/>
-          <w:b w:val="0"/>
-          <w:i w:val="0"/>
-        </w:rPr>
-        <w:t xml:space="preserve"> The FI has [office/lab space] in [department], with institutional backup storage for working data and the public archives (Zenodo, EDI) for released products.</w:t>
+        <w:t xml:space="preserve"> The full processing stack is open source (Python scientific stack, PDAL, GDAL/OGR, WhiteboxTools, PyTorch, QGIS). No commercial licenses are required.</w:t>
       </w:r>
     </w:p>
     <w:p>

</xml_diff>